<commit_message>
add frontend, backend, edit stuff
</commit_message>
<xml_diff>
--- a/docs/03_GenAI_SoftwareDevelopment_requirements-specification.docx
+++ b/docs/03_GenAI_SoftwareDevelopment_requirements-specification.docx
@@ -1,6 +1,6 @@
 
 <file path=word/document.xml><?xml version="1.0" encoding="utf-8"?>
-<w:document xmlns:wpc="http://schemas.microsoft.com/office/word/2010/wordprocessingCanvas" xmlns:cx="http://schemas.microsoft.com/office/drawing/2014/chartex" xmlns:mc="http://schemas.openxmlformats.org/markup-compatibility/2006" xmlns:o="urn:schemas-microsoft-com:office:office" xmlns:r="http://schemas.openxmlformats.org/officeDocument/2006/relationships" xmlns:m="http://schemas.openxmlformats.org/officeDocument/2006/math" xmlns:v="urn:schemas-microsoft-com:vml" xmlns:wp14="http://schemas.microsoft.com/office/word/2010/wordprocessingDrawing" xmlns:wp="http://schemas.openxmlformats.org/drawingml/2006/wordprocessingDrawing" xmlns:w10="urn:schemas-microsoft-com:office:word" xmlns:w="http://schemas.openxmlformats.org/wordprocessingml/2006/main" xmlns:w14="http://schemas.microsoft.com/office/word/2010/wordml" xmlns:w15="http://schemas.microsoft.com/office/word/2012/wordml" xmlns:w16se="http://schemas.microsoft.com/office/word/2015/wordml/symex" xmlns:wpg="http://schemas.microsoft.com/office/word/2010/wordprocessingGroup" xmlns:wpi="http://schemas.microsoft.com/office/word/2010/wordprocessingInk" xmlns:wne="http://schemas.microsoft.com/office/word/2006/wordml" xmlns:wps="http://schemas.microsoft.com/office/word/2010/wordprocessingShape" mc:Ignorable="w14 w15 w16se wp14">
+<w:document xmlns:wpc="http://schemas.microsoft.com/office/word/2010/wordprocessingCanvas" xmlns:cx="http://schemas.microsoft.com/office/drawing/2014/chartex" xmlns:cx1="http://schemas.microsoft.com/office/drawing/2015/9/8/chartex" xmlns:cx2="http://schemas.microsoft.com/office/drawing/2015/10/21/chartex" xmlns:cx3="http://schemas.microsoft.com/office/drawing/2016/5/9/chartex" xmlns:cx4="http://schemas.microsoft.com/office/drawing/2016/5/10/chartex" xmlns:cx5="http://schemas.microsoft.com/office/drawing/2016/5/11/chartex" xmlns:cx6="http://schemas.microsoft.com/office/drawing/2016/5/12/chartex" xmlns:cx7="http://schemas.microsoft.com/office/drawing/2016/5/13/chartex" xmlns:cx8="http://schemas.microsoft.com/office/drawing/2016/5/14/chartex" xmlns:mc="http://schemas.openxmlformats.org/markup-compatibility/2006" xmlns:aink="http://schemas.microsoft.com/office/drawing/2016/ink" xmlns:am3d="http://schemas.microsoft.com/office/drawing/2017/model3d" xmlns:o="urn:schemas-microsoft-com:office:office" xmlns:oel="http://schemas.microsoft.com/office/2019/extlst" xmlns:r="http://schemas.openxmlformats.org/officeDocument/2006/relationships" xmlns:m="http://schemas.openxmlformats.org/officeDocument/2006/math" xmlns:v="urn:schemas-microsoft-com:vml" xmlns:wp14="http://schemas.microsoft.com/office/word/2010/wordprocessingDrawing" xmlns:wp="http://schemas.openxmlformats.org/drawingml/2006/wordprocessingDrawing" xmlns:w10="urn:schemas-microsoft-com:office:word" xmlns:w="http://schemas.openxmlformats.org/wordprocessingml/2006/main" xmlns:w14="http://schemas.microsoft.com/office/word/2010/wordml" xmlns:w15="http://schemas.microsoft.com/office/word/2012/wordml" xmlns:w16cex="http://schemas.microsoft.com/office/word/2018/wordml/cex" xmlns:w16cid="http://schemas.microsoft.com/office/word/2016/wordml/cid" xmlns:w16="http://schemas.microsoft.com/office/word/2018/wordml" xmlns:w16du="http://schemas.microsoft.com/office/word/2023/wordml/word16du" xmlns:w16sdtdh="http://schemas.microsoft.com/office/word/2020/wordml/sdtdatahash" xmlns:w16sdtfl="http://schemas.microsoft.com/office/word/2024/wordml/sdtformatlock" xmlns:w16se="http://schemas.microsoft.com/office/word/2015/wordml/symex" xmlns:wpg="http://schemas.microsoft.com/office/word/2010/wordprocessingGroup" xmlns:wpi="http://schemas.microsoft.com/office/word/2010/wordprocessingInk" xmlns:wne="http://schemas.microsoft.com/office/word/2006/wordml" xmlns:wps="http://schemas.microsoft.com/office/word/2010/wordprocessingShape" mc:Ignorable="w14 w15 w16se w16cid w16 w16cex w16sdtdh w16sdtfl w16du wp14">
   <w:body>
     <w:sdt>
       <w:sdtPr>
@@ -6927,10 +6927,10 @@
           <w:noProof/>
         </w:rPr>
         <w:drawing>
-          <wp:inline distT="0" distB="0" distL="0" distR="0" wp14:anchorId="1487EC01" wp14:editId="3C0A26E8">
-            <wp:extent cx="5593715" cy="8397240"/>
-            <wp:effectExtent l="0" t="0" r="6985" b="3810"/>
-            <wp:docPr id="32133299" name="Picture 1" descr="PlantUML Diagram"/>
+          <wp:inline distT="0" distB="0" distL="0" distR="0" wp14:anchorId="1487EC01" wp14:editId="3B18D032">
+            <wp:extent cx="5605642" cy="8513134"/>
+            <wp:effectExtent l="0" t="0" r="0" b="2540"/>
+            <wp:docPr id="32133299" name="Picture 1"/>
             <wp:cNvGraphicFramePr>
               <a:graphicFrameLocks xmlns:a="http://schemas.openxmlformats.org/drawingml/2006/main" noChangeAspect="1"/>
             </wp:cNvGraphicFramePr>
@@ -6938,7 +6938,7 @@
               <a:graphicData uri="http://schemas.openxmlformats.org/drawingml/2006/picture">
                 <pic:pic xmlns:pic="http://schemas.openxmlformats.org/drawingml/2006/picture">
                   <pic:nvPicPr>
-                    <pic:cNvPr id="0" name="Picture 1" descr="PlantUML Diagram"/>
+                    <pic:cNvPr id="32133299" name="Picture 1"/>
                     <pic:cNvPicPr>
                       <a:picLocks noChangeAspect="1" noChangeArrowheads="1"/>
                     </pic:cNvPicPr>
@@ -6951,7 +6951,6 @@
                         </a:ext>
                       </a:extLst>
                     </a:blip>
-                    <a:srcRect/>
                     <a:stretch>
                       <a:fillRect/>
                     </a:stretch>
@@ -6959,7 +6958,7 @@
                   <pic:spPr bwMode="auto">
                     <a:xfrm>
                       <a:off x="0" y="0"/>
-                      <a:ext cx="5593715" cy="8397240"/>
+                      <a:ext cx="5635604" cy="8558636"/>
                     </a:xfrm>
                     <a:prstGeom prst="rect">
                       <a:avLst/>
@@ -16954,7 +16953,6 @@
           <w:szCs w:val="28"/>
         </w:rPr>
       </w:pPr>
-      <w:bookmarkStart w:id="52" w:name="_GoBack"/>
       <w:r>
         <w:rPr>
           <w:rFonts w:ascii="Times New Roman" w:hAnsi="Times New Roman" w:cs="Times New Roman"/>
@@ -17004,7 +17002,6 @@
           </wp:inline>
         </w:drawing>
       </w:r>
-      <w:bookmarkEnd w:id="52"/>
     </w:p>
     <w:p>
       <w:pPr>
@@ -17338,14 +17335,14 @@
           <w:rFonts w:ascii="Times New Roman" w:hAnsi="Times New Roman"/>
         </w:rPr>
       </w:pPr>
-      <w:bookmarkStart w:id="53" w:name="_Toc239754999"/>
+      <w:bookmarkStart w:id="52" w:name="_Toc239754999"/>
       <w:r>
         <w:rPr>
           <w:rFonts w:ascii="Times New Roman" w:hAnsi="Times New Roman"/>
         </w:rPr>
         <w:t>UC7_AI Trích xuất thông tin tự động</w:t>
       </w:r>
-      <w:bookmarkEnd w:id="53"/>
+      <w:bookmarkEnd w:id="52"/>
     </w:p>
     <w:p>
       <w:pPr>
@@ -17354,7 +17351,7 @@
       <w:r>
         <w:t xml:space="preserve"> </w:t>
       </w:r>
-      <w:bookmarkStart w:id="54" w:name="_Toc239755000"/>
+      <w:bookmarkStart w:id="53" w:name="_Toc239755000"/>
       <w:r>
         <w:t xml:space="preserve">Mô tả use case </w:t>
       </w:r>
@@ -17364,7 +17361,7 @@
       <w:r>
         <w:t>7</w:t>
       </w:r>
-      <w:bookmarkEnd w:id="54"/>
+      <w:bookmarkEnd w:id="53"/>
     </w:p>
     <w:tbl>
       <w:tblPr>
@@ -18008,11 +18005,11 @@
         <w:lastRenderedPageBreak/>
         <w:t xml:space="preserve"> </w:t>
       </w:r>
-      <w:bookmarkStart w:id="55" w:name="_Toc239755001"/>
+      <w:bookmarkStart w:id="54" w:name="_Toc239755001"/>
       <w:r>
         <w:t>Biểu đồ</w:t>
       </w:r>
-      <w:bookmarkEnd w:id="55"/>
+      <w:bookmarkEnd w:id="54"/>
     </w:p>
     <w:p>
       <w:pPr>
@@ -18168,7 +18165,7 @@
           <w:rFonts w:ascii="Times New Roman" w:hAnsi="Times New Roman"/>
         </w:rPr>
       </w:pPr>
-      <w:bookmarkStart w:id="56" w:name="_Toc239755002"/>
+      <w:bookmarkStart w:id="55" w:name="_Toc239755002"/>
       <w:r>
         <w:rPr>
           <w:rFonts w:ascii="Times New Roman" w:hAnsi="Times New Roman"/>
@@ -18181,7 +18178,7 @@
         </w:rPr>
         <w:t xml:space="preserve"> AI Tóm tắt văn bản thông minh</w:t>
       </w:r>
-      <w:bookmarkEnd w:id="56"/>
+      <w:bookmarkEnd w:id="55"/>
     </w:p>
     <w:p>
       <w:pPr>
@@ -18196,7 +18193,7 @@
         </w:rPr>
         <w:t xml:space="preserve"> </w:t>
       </w:r>
-      <w:bookmarkStart w:id="57" w:name="_Toc239755003"/>
+      <w:bookmarkStart w:id="56" w:name="_Toc239755003"/>
       <w:r>
         <w:rPr>
           <w:lang w:val="vi-VN"/>
@@ -18215,7 +18212,7 @@
         </w:rPr>
         <w:t>8</w:t>
       </w:r>
-      <w:bookmarkEnd w:id="57"/>
+      <w:bookmarkEnd w:id="56"/>
     </w:p>
     <w:tbl>
       <w:tblPr>
@@ -18958,14 +18955,14 @@
         </w:rPr>
         <w:t xml:space="preserve"> </w:t>
       </w:r>
-      <w:bookmarkStart w:id="58" w:name="_Toc239755004"/>
+      <w:bookmarkStart w:id="57" w:name="_Toc239755004"/>
       <w:r>
         <w:rPr>
           <w:lang w:val="vi-VN"/>
         </w:rPr>
         <w:t>Biểu đồ</w:t>
       </w:r>
-      <w:bookmarkEnd w:id="58"/>
+      <w:bookmarkEnd w:id="57"/>
     </w:p>
     <w:p>
       <w:pPr>
@@ -19134,7 +19131,7 @@
           <w:rFonts w:ascii="Times New Roman" w:hAnsi="Times New Roman"/>
         </w:rPr>
       </w:pPr>
-      <w:bookmarkStart w:id="59" w:name="_Toc239755005"/>
+      <w:bookmarkStart w:id="58" w:name="_Toc239755005"/>
       <w:r>
         <w:rPr>
           <w:rFonts w:ascii="Times New Roman" w:hAnsi="Times New Roman"/>
@@ -19147,13 +19144,13 @@
         </w:rPr>
         <w:t xml:space="preserve"> AI Phân loại &amp; Gợi ý ưu tiên</w:t>
       </w:r>
-      <w:bookmarkEnd w:id="59"/>
+      <w:bookmarkEnd w:id="58"/>
     </w:p>
     <w:p>
       <w:pPr>
         <w:pStyle w:val="Heading3"/>
       </w:pPr>
-      <w:bookmarkStart w:id="60" w:name="_Toc239755006"/>
+      <w:bookmarkStart w:id="59" w:name="_Toc239755006"/>
       <w:r>
         <w:t xml:space="preserve">Mô tả use case </w:t>
       </w:r>
@@ -19163,7 +19160,7 @@
       <w:r>
         <w:t>9</w:t>
       </w:r>
-      <w:bookmarkEnd w:id="60"/>
+      <w:bookmarkEnd w:id="59"/>
     </w:p>
     <w:p>
       <w:pPr>
@@ -20048,7 +20045,7 @@
           <w:rFonts w:ascii="Times New Roman" w:hAnsi="Times New Roman"/>
         </w:rPr>
       </w:pPr>
-      <w:bookmarkStart w:id="61" w:name="_Toc239755007"/>
+      <w:bookmarkStart w:id="60" w:name="_Toc239755007"/>
       <w:r>
         <w:rPr>
           <w:rFonts w:ascii="Times New Roman" w:hAnsi="Times New Roman"/>
@@ -20062,13 +20059,13 @@
         </w:rPr>
         <w:t xml:space="preserve"> AI Sinh dự thảo phản hồi</w:t>
       </w:r>
-      <w:bookmarkEnd w:id="61"/>
+      <w:bookmarkEnd w:id="60"/>
     </w:p>
     <w:p>
       <w:pPr>
         <w:pStyle w:val="Heading3"/>
       </w:pPr>
-      <w:bookmarkStart w:id="62" w:name="_Toc239755008"/>
+      <w:bookmarkStart w:id="61" w:name="_Toc239755008"/>
       <w:r>
         <w:t xml:space="preserve">Mô tả use case </w:t>
       </w:r>
@@ -20078,7 +20075,7 @@
       <w:r>
         <w:t>10</w:t>
       </w:r>
-      <w:bookmarkEnd w:id="62"/>
+      <w:bookmarkEnd w:id="61"/>
     </w:p>
     <w:tbl>
       <w:tblPr>
@@ -20806,11 +20803,11 @@
         <w:lastRenderedPageBreak/>
         <w:t xml:space="preserve"> </w:t>
       </w:r>
-      <w:bookmarkStart w:id="63" w:name="_Toc239755009"/>
+      <w:bookmarkStart w:id="62" w:name="_Toc239755009"/>
       <w:r>
         <w:t>Biểu đồ</w:t>
       </w:r>
-      <w:bookmarkEnd w:id="63"/>
+      <w:bookmarkEnd w:id="62"/>
     </w:p>
     <w:p>
       <w:pPr>
@@ -20978,7 +20975,7 @@
           <w:rFonts w:ascii="Times New Roman" w:hAnsi="Times New Roman"/>
         </w:rPr>
       </w:pPr>
-      <w:bookmarkStart w:id="64" w:name="_Toc239755010"/>
+      <w:bookmarkStart w:id="63" w:name="_Toc239755010"/>
       <w:r>
         <w:rPr>
           <w:rFonts w:ascii="Times New Roman" w:hAnsi="Times New Roman"/>
@@ -20991,13 +20988,13 @@
         </w:rPr>
         <w:t xml:space="preserve"> Xem Dashboard báo cáo thống kê</w:t>
       </w:r>
-      <w:bookmarkEnd w:id="64"/>
+      <w:bookmarkEnd w:id="63"/>
     </w:p>
     <w:p>
       <w:pPr>
         <w:pStyle w:val="Heading3"/>
       </w:pPr>
-      <w:bookmarkStart w:id="65" w:name="_Toc239755011"/>
+      <w:bookmarkStart w:id="64" w:name="_Toc239755011"/>
       <w:r>
         <w:t xml:space="preserve">Mô tả use case </w:t>
       </w:r>
@@ -21007,7 +21004,7 @@
       <w:r>
         <w:t>11</w:t>
       </w:r>
-      <w:bookmarkEnd w:id="65"/>
+      <w:bookmarkEnd w:id="64"/>
     </w:p>
     <w:tbl>
       <w:tblPr>
@@ -21680,14 +21677,14 @@
         </w:rPr>
         <w:t xml:space="preserve"> </w:t>
       </w:r>
-      <w:bookmarkStart w:id="66" w:name="_Toc239755012"/>
+      <w:bookmarkStart w:id="65" w:name="_Toc239755012"/>
       <w:r>
         <w:rPr>
           <w:lang w:val="vi-VN"/>
         </w:rPr>
         <w:t>Biểu đồ</w:t>
       </w:r>
-      <w:bookmarkEnd w:id="66"/>
+      <w:bookmarkEnd w:id="65"/>
     </w:p>
     <w:p>
       <w:pPr>
@@ -21884,7 +21881,7 @@
           <w:lang w:val="vi-VN"/>
         </w:rPr>
       </w:pPr>
-      <w:bookmarkStart w:id="67" w:name="_Toc239755013"/>
+      <w:bookmarkStart w:id="66" w:name="_Toc239755013"/>
       <w:r>
         <w:rPr>
           <w:rFonts w:ascii="Times New Roman" w:hAnsi="Times New Roman"/>
@@ -21912,7 +21909,7 @@
         </w:rPr>
         <w:t>)</w:t>
       </w:r>
-      <w:bookmarkEnd w:id="67"/>
+      <w:bookmarkEnd w:id="66"/>
     </w:p>
     <w:p>
       <w:pPr>
@@ -22667,11 +22664,11 @@
       <w:r>
         <w:t xml:space="preserve"> </w:t>
       </w:r>
-      <w:bookmarkStart w:id="68" w:name="_Toc239755014"/>
+      <w:bookmarkStart w:id="67" w:name="_Toc239755014"/>
       <w:r>
         <w:t>Biểu đồ</w:t>
       </w:r>
-      <w:bookmarkEnd w:id="68"/>
+      <w:bookmarkEnd w:id="67"/>
     </w:p>
     <w:p>
       <w:pPr>
@@ -22832,21 +22829,21 @@
       <w:pPr>
         <w:pStyle w:val="Heading1"/>
       </w:pPr>
-      <w:bookmarkStart w:id="69" w:name="_Toc239755015"/>
+      <w:bookmarkStart w:id="68" w:name="_Toc239755015"/>
       <w:r>
         <w:t>CÁC THÔNG TIN HỖ TRỢ KHÁC</w:t>
       </w:r>
-      <w:bookmarkEnd w:id="69"/>
+      <w:bookmarkEnd w:id="68"/>
     </w:p>
     <w:p>
       <w:pPr>
         <w:pStyle w:val="Heading2"/>
       </w:pPr>
-      <w:bookmarkStart w:id="70" w:name="_Toc239755016"/>
+      <w:bookmarkStart w:id="69" w:name="_Toc239755016"/>
       <w:r>
         <w:t>Yêu cầu phi chức năng (NFR)</w:t>
       </w:r>
-      <w:bookmarkEnd w:id="70"/>
+      <w:bookmarkEnd w:id="69"/>
     </w:p>
     <w:p>
       <w:pPr>
@@ -23520,11 +23517,11 @@
       <w:pPr>
         <w:pStyle w:val="Heading2"/>
       </w:pPr>
-      <w:bookmarkStart w:id="71" w:name="_Toc239755017"/>
+      <w:bookmarkStart w:id="70" w:name="_Toc239755017"/>
       <w:r>
         <w:t>Các quy tắc nghiệp vụ (Business Rules)</w:t>
       </w:r>
-      <w:bookmarkEnd w:id="71"/>
+      <w:bookmarkEnd w:id="70"/>
     </w:p>
     <w:p>
       <w:pPr>
@@ -23784,7 +23781,7 @@
 </file>
 
 <file path=word/endnotes.xml><?xml version="1.0" encoding="utf-8"?>
-<w:endnotes xmlns:wpc="http://schemas.microsoft.com/office/word/2010/wordprocessingCanvas" xmlns:cx="http://schemas.microsoft.com/office/drawing/2014/chartex" xmlns:mc="http://schemas.openxmlformats.org/markup-compatibility/2006" xmlns:o="urn:schemas-microsoft-com:office:office" xmlns:r="http://schemas.openxmlformats.org/officeDocument/2006/relationships" xmlns:m="http://schemas.openxmlformats.org/officeDocument/2006/math" xmlns:v="urn:schemas-microsoft-com:vml" xmlns:wp14="http://schemas.microsoft.com/office/word/2010/wordprocessingDrawing" xmlns:wp="http://schemas.openxmlformats.org/drawingml/2006/wordprocessingDrawing" xmlns:w10="urn:schemas-microsoft-com:office:word" xmlns:w="http://schemas.openxmlformats.org/wordprocessingml/2006/main" xmlns:w14="http://schemas.microsoft.com/office/word/2010/wordml" xmlns:w15="http://schemas.microsoft.com/office/word/2012/wordml" xmlns:w16se="http://schemas.microsoft.com/office/word/2015/wordml/symex" xmlns:wpg="http://schemas.microsoft.com/office/word/2010/wordprocessingGroup" xmlns:wpi="http://schemas.microsoft.com/office/word/2010/wordprocessingInk" xmlns:wne="http://schemas.microsoft.com/office/word/2006/wordml" xmlns:wps="http://schemas.microsoft.com/office/word/2010/wordprocessingShape" mc:Ignorable="w14 w15 w16se wp14">
+<w:endnotes xmlns:wpc="http://schemas.microsoft.com/office/word/2010/wordprocessingCanvas" xmlns:cx="http://schemas.microsoft.com/office/drawing/2014/chartex" xmlns:cx1="http://schemas.microsoft.com/office/drawing/2015/9/8/chartex" xmlns:cx2="http://schemas.microsoft.com/office/drawing/2015/10/21/chartex" xmlns:cx3="http://schemas.microsoft.com/office/drawing/2016/5/9/chartex" xmlns:cx4="http://schemas.microsoft.com/office/drawing/2016/5/10/chartex" xmlns:cx5="http://schemas.microsoft.com/office/drawing/2016/5/11/chartex" xmlns:cx6="http://schemas.microsoft.com/office/drawing/2016/5/12/chartex" xmlns:cx7="http://schemas.microsoft.com/office/drawing/2016/5/13/chartex" xmlns:cx8="http://schemas.microsoft.com/office/drawing/2016/5/14/chartex" xmlns:mc="http://schemas.openxmlformats.org/markup-compatibility/2006" xmlns:aink="http://schemas.microsoft.com/office/drawing/2016/ink" xmlns:am3d="http://schemas.microsoft.com/office/drawing/2017/model3d" xmlns:o="urn:schemas-microsoft-com:office:office" xmlns:oel="http://schemas.microsoft.com/office/2019/extlst" xmlns:r="http://schemas.openxmlformats.org/officeDocument/2006/relationships" xmlns:m="http://schemas.openxmlformats.org/officeDocument/2006/math" xmlns:v="urn:schemas-microsoft-com:vml" xmlns:wp14="http://schemas.microsoft.com/office/word/2010/wordprocessingDrawing" xmlns:wp="http://schemas.openxmlformats.org/drawingml/2006/wordprocessingDrawing" xmlns:w10="urn:schemas-microsoft-com:office:word" xmlns:w="http://schemas.openxmlformats.org/wordprocessingml/2006/main" xmlns:w14="http://schemas.microsoft.com/office/word/2010/wordml" xmlns:w15="http://schemas.microsoft.com/office/word/2012/wordml" xmlns:w16cex="http://schemas.microsoft.com/office/word/2018/wordml/cex" xmlns:w16cid="http://schemas.microsoft.com/office/word/2016/wordml/cid" xmlns:w16="http://schemas.microsoft.com/office/word/2018/wordml" xmlns:w16du="http://schemas.microsoft.com/office/word/2023/wordml/word16du" xmlns:w16sdtdh="http://schemas.microsoft.com/office/word/2020/wordml/sdtdatahash" xmlns:w16sdtfl="http://schemas.microsoft.com/office/word/2024/wordml/sdtformatlock" xmlns:w16se="http://schemas.microsoft.com/office/word/2015/wordml/symex" xmlns:wpg="http://schemas.microsoft.com/office/word/2010/wordprocessingGroup" xmlns:wpi="http://schemas.microsoft.com/office/word/2010/wordprocessingInk" xmlns:wne="http://schemas.microsoft.com/office/word/2006/wordml" xmlns:wps="http://schemas.microsoft.com/office/word/2010/wordprocessingShape" mc:Ignorable="w14 w15 w16se w16cid w16 w16cex w16sdtdh w16sdtfl w16du wp14">
   <w:endnote w:type="separator" w:id="-1">
     <w:p>
       <w:pPr>
@@ -23809,7 +23806,7 @@
 </file>
 
 <file path=word/footer1.xml><?xml version="1.0" encoding="utf-8"?>
-<w:ftr xmlns:wpc="http://schemas.microsoft.com/office/word/2010/wordprocessingCanvas" xmlns:cx="http://schemas.microsoft.com/office/drawing/2014/chartex" xmlns:mc="http://schemas.openxmlformats.org/markup-compatibility/2006" xmlns:o="urn:schemas-microsoft-com:office:office" xmlns:r="http://schemas.openxmlformats.org/officeDocument/2006/relationships" xmlns:m="http://schemas.openxmlformats.org/officeDocument/2006/math" xmlns:v="urn:schemas-microsoft-com:vml" xmlns:wp14="http://schemas.microsoft.com/office/word/2010/wordprocessingDrawing" xmlns:wp="http://schemas.openxmlformats.org/drawingml/2006/wordprocessingDrawing" xmlns:w10="urn:schemas-microsoft-com:office:word" xmlns:w="http://schemas.openxmlformats.org/wordprocessingml/2006/main" xmlns:w14="http://schemas.microsoft.com/office/word/2010/wordml" xmlns:w15="http://schemas.microsoft.com/office/word/2012/wordml" xmlns:w16se="http://schemas.microsoft.com/office/word/2015/wordml/symex" xmlns:wpg="http://schemas.microsoft.com/office/word/2010/wordprocessingGroup" xmlns:wpi="http://schemas.microsoft.com/office/word/2010/wordprocessingInk" xmlns:wne="http://schemas.microsoft.com/office/word/2006/wordml" xmlns:wps="http://schemas.microsoft.com/office/word/2010/wordprocessingShape" mc:Ignorable="w14 w15 w16se wp14">
+<w:ftr xmlns:wpc="http://schemas.microsoft.com/office/word/2010/wordprocessingCanvas" xmlns:cx="http://schemas.microsoft.com/office/drawing/2014/chartex" xmlns:cx1="http://schemas.microsoft.com/office/drawing/2015/9/8/chartex" xmlns:cx2="http://schemas.microsoft.com/office/drawing/2015/10/21/chartex" xmlns:cx3="http://schemas.microsoft.com/office/drawing/2016/5/9/chartex" xmlns:cx4="http://schemas.microsoft.com/office/drawing/2016/5/10/chartex" xmlns:cx5="http://schemas.microsoft.com/office/drawing/2016/5/11/chartex" xmlns:cx6="http://schemas.microsoft.com/office/drawing/2016/5/12/chartex" xmlns:cx7="http://schemas.microsoft.com/office/drawing/2016/5/13/chartex" xmlns:cx8="http://schemas.microsoft.com/office/drawing/2016/5/14/chartex" xmlns:mc="http://schemas.openxmlformats.org/markup-compatibility/2006" xmlns:aink="http://schemas.microsoft.com/office/drawing/2016/ink" xmlns:am3d="http://schemas.microsoft.com/office/drawing/2017/model3d" xmlns:o="urn:schemas-microsoft-com:office:office" xmlns:oel="http://schemas.microsoft.com/office/2019/extlst" xmlns:r="http://schemas.openxmlformats.org/officeDocument/2006/relationships" xmlns:m="http://schemas.openxmlformats.org/officeDocument/2006/math" xmlns:v="urn:schemas-microsoft-com:vml" xmlns:wp14="http://schemas.microsoft.com/office/word/2010/wordprocessingDrawing" xmlns:wp="http://schemas.openxmlformats.org/drawingml/2006/wordprocessingDrawing" xmlns:w10="urn:schemas-microsoft-com:office:word" xmlns:w="http://schemas.openxmlformats.org/wordprocessingml/2006/main" xmlns:w14="http://schemas.microsoft.com/office/word/2010/wordml" xmlns:w15="http://schemas.microsoft.com/office/word/2012/wordml" xmlns:w16cex="http://schemas.microsoft.com/office/word/2018/wordml/cex" xmlns:w16cid="http://schemas.microsoft.com/office/word/2016/wordml/cid" xmlns:w16="http://schemas.microsoft.com/office/word/2018/wordml" xmlns:w16du="http://schemas.microsoft.com/office/word/2023/wordml/word16du" xmlns:w16sdtdh="http://schemas.microsoft.com/office/word/2020/wordml/sdtdatahash" xmlns:w16sdtfl="http://schemas.microsoft.com/office/word/2024/wordml/sdtformatlock" xmlns:w16se="http://schemas.microsoft.com/office/word/2015/wordml/symex" xmlns:wpg="http://schemas.microsoft.com/office/word/2010/wordprocessingGroup" xmlns:wpi="http://schemas.microsoft.com/office/word/2010/wordprocessingInk" xmlns:wne="http://schemas.microsoft.com/office/word/2006/wordml" xmlns:wps="http://schemas.microsoft.com/office/word/2010/wordprocessingShape" mc:Ignorable="w14 w15 w16se w16cid w16 w16cex w16sdtdh w16sdtfl w16du wp14">
   <w:p>
     <w:pPr>
       <w:pStyle w:val="Footer"/>
@@ -23819,7 +23816,7 @@
 </file>
 
 <file path=word/footer2.xml><?xml version="1.0" encoding="utf-8"?>
-<w:ftr xmlns:wpc="http://schemas.microsoft.com/office/word/2010/wordprocessingCanvas" xmlns:cx="http://schemas.microsoft.com/office/drawing/2014/chartex" xmlns:mc="http://schemas.openxmlformats.org/markup-compatibility/2006" xmlns:o="urn:schemas-microsoft-com:office:office" xmlns:r="http://schemas.openxmlformats.org/officeDocument/2006/relationships" xmlns:m="http://schemas.openxmlformats.org/officeDocument/2006/math" xmlns:v="urn:schemas-microsoft-com:vml" xmlns:wp14="http://schemas.microsoft.com/office/word/2010/wordprocessingDrawing" xmlns:wp="http://schemas.openxmlformats.org/drawingml/2006/wordprocessingDrawing" xmlns:w10="urn:schemas-microsoft-com:office:word" xmlns:w="http://schemas.openxmlformats.org/wordprocessingml/2006/main" xmlns:w14="http://schemas.microsoft.com/office/word/2010/wordml" xmlns:w15="http://schemas.microsoft.com/office/word/2012/wordml" xmlns:w16se="http://schemas.microsoft.com/office/word/2015/wordml/symex" xmlns:wpg="http://schemas.microsoft.com/office/word/2010/wordprocessingGroup" xmlns:wpi="http://schemas.microsoft.com/office/word/2010/wordprocessingInk" xmlns:wne="http://schemas.microsoft.com/office/word/2006/wordml" xmlns:wps="http://schemas.microsoft.com/office/word/2010/wordprocessingShape" mc:Ignorable="w14 w15 w16se wp14">
+<w:ftr xmlns:wpc="http://schemas.microsoft.com/office/word/2010/wordprocessingCanvas" xmlns:cx="http://schemas.microsoft.com/office/drawing/2014/chartex" xmlns:cx1="http://schemas.microsoft.com/office/drawing/2015/9/8/chartex" xmlns:cx2="http://schemas.microsoft.com/office/drawing/2015/10/21/chartex" xmlns:cx3="http://schemas.microsoft.com/office/drawing/2016/5/9/chartex" xmlns:cx4="http://schemas.microsoft.com/office/drawing/2016/5/10/chartex" xmlns:cx5="http://schemas.microsoft.com/office/drawing/2016/5/11/chartex" xmlns:cx6="http://schemas.microsoft.com/office/drawing/2016/5/12/chartex" xmlns:cx7="http://schemas.microsoft.com/office/drawing/2016/5/13/chartex" xmlns:cx8="http://schemas.microsoft.com/office/drawing/2016/5/14/chartex" xmlns:mc="http://schemas.openxmlformats.org/markup-compatibility/2006" xmlns:aink="http://schemas.microsoft.com/office/drawing/2016/ink" xmlns:am3d="http://schemas.microsoft.com/office/drawing/2017/model3d" xmlns:o="urn:schemas-microsoft-com:office:office" xmlns:oel="http://schemas.microsoft.com/office/2019/extlst" xmlns:r="http://schemas.openxmlformats.org/officeDocument/2006/relationships" xmlns:m="http://schemas.openxmlformats.org/officeDocument/2006/math" xmlns:v="urn:schemas-microsoft-com:vml" xmlns:wp14="http://schemas.microsoft.com/office/word/2010/wordprocessingDrawing" xmlns:wp="http://schemas.openxmlformats.org/drawingml/2006/wordprocessingDrawing" xmlns:w10="urn:schemas-microsoft-com:office:word" xmlns:w="http://schemas.openxmlformats.org/wordprocessingml/2006/main" xmlns:w14="http://schemas.microsoft.com/office/word/2010/wordml" xmlns:w15="http://schemas.microsoft.com/office/word/2012/wordml" xmlns:w16cex="http://schemas.microsoft.com/office/word/2018/wordml/cex" xmlns:w16cid="http://schemas.microsoft.com/office/word/2016/wordml/cid" xmlns:w16="http://schemas.microsoft.com/office/word/2018/wordml" xmlns:w16du="http://schemas.microsoft.com/office/word/2023/wordml/word16du" xmlns:w16sdtdh="http://schemas.microsoft.com/office/word/2020/wordml/sdtdatahash" xmlns:w16sdtfl="http://schemas.microsoft.com/office/word/2024/wordml/sdtformatlock" xmlns:w16se="http://schemas.microsoft.com/office/word/2015/wordml/symex" xmlns:wpg="http://schemas.microsoft.com/office/word/2010/wordprocessingGroup" xmlns:wpi="http://schemas.microsoft.com/office/word/2010/wordprocessingInk" xmlns:wne="http://schemas.microsoft.com/office/word/2006/wordml" xmlns:wps="http://schemas.microsoft.com/office/word/2010/wordprocessingShape" mc:Ignorable="w14 w15 w16se w16cid w16 w16cex w16sdtdh w16sdtfl w16du wp14">
   <w:sdt>
     <w:sdtPr>
       <w:id w:val="433639618"/>
@@ -23883,7 +23880,7 @@
 </file>
 
 <file path=word/footer3.xml><?xml version="1.0" encoding="utf-8"?>
-<w:ftr xmlns:wpc="http://schemas.microsoft.com/office/word/2010/wordprocessingCanvas" xmlns:cx="http://schemas.microsoft.com/office/drawing/2014/chartex" xmlns:mc="http://schemas.openxmlformats.org/markup-compatibility/2006" xmlns:o="urn:schemas-microsoft-com:office:office" xmlns:r="http://schemas.openxmlformats.org/officeDocument/2006/relationships" xmlns:m="http://schemas.openxmlformats.org/officeDocument/2006/math" xmlns:v="urn:schemas-microsoft-com:vml" xmlns:wp14="http://schemas.microsoft.com/office/word/2010/wordprocessingDrawing" xmlns:wp="http://schemas.openxmlformats.org/drawingml/2006/wordprocessingDrawing" xmlns:w10="urn:schemas-microsoft-com:office:word" xmlns:w="http://schemas.openxmlformats.org/wordprocessingml/2006/main" xmlns:w14="http://schemas.microsoft.com/office/word/2010/wordml" xmlns:w15="http://schemas.microsoft.com/office/word/2012/wordml" xmlns:w16se="http://schemas.microsoft.com/office/word/2015/wordml/symex" xmlns:wpg="http://schemas.microsoft.com/office/word/2010/wordprocessingGroup" xmlns:wpi="http://schemas.microsoft.com/office/word/2010/wordprocessingInk" xmlns:wne="http://schemas.microsoft.com/office/word/2006/wordml" xmlns:wps="http://schemas.microsoft.com/office/word/2010/wordprocessingShape" mc:Ignorable="w14 w15 w16se wp14">
+<w:ftr xmlns:wpc="http://schemas.microsoft.com/office/word/2010/wordprocessingCanvas" xmlns:cx="http://schemas.microsoft.com/office/drawing/2014/chartex" xmlns:cx1="http://schemas.microsoft.com/office/drawing/2015/9/8/chartex" xmlns:cx2="http://schemas.microsoft.com/office/drawing/2015/10/21/chartex" xmlns:cx3="http://schemas.microsoft.com/office/drawing/2016/5/9/chartex" xmlns:cx4="http://schemas.microsoft.com/office/drawing/2016/5/10/chartex" xmlns:cx5="http://schemas.microsoft.com/office/drawing/2016/5/11/chartex" xmlns:cx6="http://schemas.microsoft.com/office/drawing/2016/5/12/chartex" xmlns:cx7="http://schemas.microsoft.com/office/drawing/2016/5/13/chartex" xmlns:cx8="http://schemas.microsoft.com/office/drawing/2016/5/14/chartex" xmlns:mc="http://schemas.openxmlformats.org/markup-compatibility/2006" xmlns:aink="http://schemas.microsoft.com/office/drawing/2016/ink" xmlns:am3d="http://schemas.microsoft.com/office/drawing/2017/model3d" xmlns:o="urn:schemas-microsoft-com:office:office" xmlns:oel="http://schemas.microsoft.com/office/2019/extlst" xmlns:r="http://schemas.openxmlformats.org/officeDocument/2006/relationships" xmlns:m="http://schemas.openxmlformats.org/officeDocument/2006/math" xmlns:v="urn:schemas-microsoft-com:vml" xmlns:wp14="http://schemas.microsoft.com/office/word/2010/wordprocessingDrawing" xmlns:wp="http://schemas.openxmlformats.org/drawingml/2006/wordprocessingDrawing" xmlns:w10="urn:schemas-microsoft-com:office:word" xmlns:w="http://schemas.openxmlformats.org/wordprocessingml/2006/main" xmlns:w14="http://schemas.microsoft.com/office/word/2010/wordml" xmlns:w15="http://schemas.microsoft.com/office/word/2012/wordml" xmlns:w16cex="http://schemas.microsoft.com/office/word/2018/wordml/cex" xmlns:w16cid="http://schemas.microsoft.com/office/word/2016/wordml/cid" xmlns:w16="http://schemas.microsoft.com/office/word/2018/wordml" xmlns:w16du="http://schemas.microsoft.com/office/word/2023/wordml/word16du" xmlns:w16sdtdh="http://schemas.microsoft.com/office/word/2020/wordml/sdtdatahash" xmlns:w16sdtfl="http://schemas.microsoft.com/office/word/2024/wordml/sdtformatlock" xmlns:w16se="http://schemas.microsoft.com/office/word/2015/wordml/symex" xmlns:wpg="http://schemas.microsoft.com/office/word/2010/wordprocessingGroup" xmlns:wpi="http://schemas.microsoft.com/office/word/2010/wordprocessingInk" xmlns:wne="http://schemas.microsoft.com/office/word/2006/wordml" xmlns:wps="http://schemas.microsoft.com/office/word/2010/wordprocessingShape" mc:Ignorable="w14 w15 w16se w16cid w16 w16cex w16sdtdh w16sdtfl w16du wp14">
   <w:sdt>
     <w:sdtPr>
       <w:id w:val="-1949926651"/>
@@ -23947,7 +23944,7 @@
 </file>
 
 <file path=word/footnotes.xml><?xml version="1.0" encoding="utf-8"?>
-<w:footnotes xmlns:wpc="http://schemas.microsoft.com/office/word/2010/wordprocessingCanvas" xmlns:cx="http://schemas.microsoft.com/office/drawing/2014/chartex" xmlns:mc="http://schemas.openxmlformats.org/markup-compatibility/2006" xmlns:o="urn:schemas-microsoft-com:office:office" xmlns:r="http://schemas.openxmlformats.org/officeDocument/2006/relationships" xmlns:m="http://schemas.openxmlformats.org/officeDocument/2006/math" xmlns:v="urn:schemas-microsoft-com:vml" xmlns:wp14="http://schemas.microsoft.com/office/word/2010/wordprocessingDrawing" xmlns:wp="http://schemas.openxmlformats.org/drawingml/2006/wordprocessingDrawing" xmlns:w10="urn:schemas-microsoft-com:office:word" xmlns:w="http://schemas.openxmlformats.org/wordprocessingml/2006/main" xmlns:w14="http://schemas.microsoft.com/office/word/2010/wordml" xmlns:w15="http://schemas.microsoft.com/office/word/2012/wordml" xmlns:w16se="http://schemas.microsoft.com/office/word/2015/wordml/symex" xmlns:wpg="http://schemas.microsoft.com/office/word/2010/wordprocessingGroup" xmlns:wpi="http://schemas.microsoft.com/office/word/2010/wordprocessingInk" xmlns:wne="http://schemas.microsoft.com/office/word/2006/wordml" xmlns:wps="http://schemas.microsoft.com/office/word/2010/wordprocessingShape" mc:Ignorable="w14 w15 w16se wp14">
+<w:footnotes xmlns:wpc="http://schemas.microsoft.com/office/word/2010/wordprocessingCanvas" xmlns:cx="http://schemas.microsoft.com/office/drawing/2014/chartex" xmlns:cx1="http://schemas.microsoft.com/office/drawing/2015/9/8/chartex" xmlns:cx2="http://schemas.microsoft.com/office/drawing/2015/10/21/chartex" xmlns:cx3="http://schemas.microsoft.com/office/drawing/2016/5/9/chartex" xmlns:cx4="http://schemas.microsoft.com/office/drawing/2016/5/10/chartex" xmlns:cx5="http://schemas.microsoft.com/office/drawing/2016/5/11/chartex" xmlns:cx6="http://schemas.microsoft.com/office/drawing/2016/5/12/chartex" xmlns:cx7="http://schemas.microsoft.com/office/drawing/2016/5/13/chartex" xmlns:cx8="http://schemas.microsoft.com/office/drawing/2016/5/14/chartex" xmlns:mc="http://schemas.openxmlformats.org/markup-compatibility/2006" xmlns:aink="http://schemas.microsoft.com/office/drawing/2016/ink" xmlns:am3d="http://schemas.microsoft.com/office/drawing/2017/model3d" xmlns:o="urn:schemas-microsoft-com:office:office" xmlns:oel="http://schemas.microsoft.com/office/2019/extlst" xmlns:r="http://schemas.openxmlformats.org/officeDocument/2006/relationships" xmlns:m="http://schemas.openxmlformats.org/officeDocument/2006/math" xmlns:v="urn:schemas-microsoft-com:vml" xmlns:wp14="http://schemas.microsoft.com/office/word/2010/wordprocessingDrawing" xmlns:wp="http://schemas.openxmlformats.org/drawingml/2006/wordprocessingDrawing" xmlns:w10="urn:schemas-microsoft-com:office:word" xmlns:w="http://schemas.openxmlformats.org/wordprocessingml/2006/main" xmlns:w14="http://schemas.microsoft.com/office/word/2010/wordml" xmlns:w15="http://schemas.microsoft.com/office/word/2012/wordml" xmlns:w16cex="http://schemas.microsoft.com/office/word/2018/wordml/cex" xmlns:w16cid="http://schemas.microsoft.com/office/word/2016/wordml/cid" xmlns:w16="http://schemas.microsoft.com/office/word/2018/wordml" xmlns:w16du="http://schemas.microsoft.com/office/word/2023/wordml/word16du" xmlns:w16sdtdh="http://schemas.microsoft.com/office/word/2020/wordml/sdtdatahash" xmlns:w16sdtfl="http://schemas.microsoft.com/office/word/2024/wordml/sdtformatlock" xmlns:w16se="http://schemas.microsoft.com/office/word/2015/wordml/symex" xmlns:wpg="http://schemas.microsoft.com/office/word/2010/wordprocessingGroup" xmlns:wpi="http://schemas.microsoft.com/office/word/2010/wordprocessingInk" xmlns:wne="http://schemas.microsoft.com/office/word/2006/wordml" xmlns:wps="http://schemas.microsoft.com/office/word/2010/wordprocessingShape" mc:Ignorable="w14 w15 w16se w16cid w16 w16cex w16sdtdh w16sdtfl w16du wp14">
   <w:footnote w:type="separator" w:id="-1">
     <w:p>
       <w:pPr>
@@ -23972,7 +23969,7 @@
 </file>
 
 <file path=word/header1.xml><?xml version="1.0" encoding="utf-8"?>
-<w:hdr xmlns:wpc="http://schemas.microsoft.com/office/word/2010/wordprocessingCanvas" xmlns:cx="http://schemas.microsoft.com/office/drawing/2014/chartex" xmlns:mc="http://schemas.openxmlformats.org/markup-compatibility/2006" xmlns:o="urn:schemas-microsoft-com:office:office" xmlns:r="http://schemas.openxmlformats.org/officeDocument/2006/relationships" xmlns:m="http://schemas.openxmlformats.org/officeDocument/2006/math" xmlns:v="urn:schemas-microsoft-com:vml" xmlns:wp14="http://schemas.microsoft.com/office/word/2010/wordprocessingDrawing" xmlns:wp="http://schemas.openxmlformats.org/drawingml/2006/wordprocessingDrawing" xmlns:w10="urn:schemas-microsoft-com:office:word" xmlns:w="http://schemas.openxmlformats.org/wordprocessingml/2006/main" xmlns:w14="http://schemas.microsoft.com/office/word/2010/wordml" xmlns:w15="http://schemas.microsoft.com/office/word/2012/wordml" xmlns:w16se="http://schemas.microsoft.com/office/word/2015/wordml/symex" xmlns:wpg="http://schemas.microsoft.com/office/word/2010/wordprocessingGroup" xmlns:wpi="http://schemas.microsoft.com/office/word/2010/wordprocessingInk" xmlns:wne="http://schemas.microsoft.com/office/word/2006/wordml" xmlns:wps="http://schemas.microsoft.com/office/word/2010/wordprocessingShape" mc:Ignorable="w14 w15 w16se wp14">
+<w:hdr xmlns:wpc="http://schemas.microsoft.com/office/word/2010/wordprocessingCanvas" xmlns:cx="http://schemas.microsoft.com/office/drawing/2014/chartex" xmlns:cx1="http://schemas.microsoft.com/office/drawing/2015/9/8/chartex" xmlns:cx2="http://schemas.microsoft.com/office/drawing/2015/10/21/chartex" xmlns:cx3="http://schemas.microsoft.com/office/drawing/2016/5/9/chartex" xmlns:cx4="http://schemas.microsoft.com/office/drawing/2016/5/10/chartex" xmlns:cx5="http://schemas.microsoft.com/office/drawing/2016/5/11/chartex" xmlns:cx6="http://schemas.microsoft.com/office/drawing/2016/5/12/chartex" xmlns:cx7="http://schemas.microsoft.com/office/drawing/2016/5/13/chartex" xmlns:cx8="http://schemas.microsoft.com/office/drawing/2016/5/14/chartex" xmlns:mc="http://schemas.openxmlformats.org/markup-compatibility/2006" xmlns:aink="http://schemas.microsoft.com/office/drawing/2016/ink" xmlns:am3d="http://schemas.microsoft.com/office/drawing/2017/model3d" xmlns:o="urn:schemas-microsoft-com:office:office" xmlns:oel="http://schemas.microsoft.com/office/2019/extlst" xmlns:r="http://schemas.openxmlformats.org/officeDocument/2006/relationships" xmlns:m="http://schemas.openxmlformats.org/officeDocument/2006/math" xmlns:v="urn:schemas-microsoft-com:vml" xmlns:wp14="http://schemas.microsoft.com/office/word/2010/wordprocessingDrawing" xmlns:wp="http://schemas.openxmlformats.org/drawingml/2006/wordprocessingDrawing" xmlns:w10="urn:schemas-microsoft-com:office:word" xmlns:w="http://schemas.openxmlformats.org/wordprocessingml/2006/main" xmlns:w14="http://schemas.microsoft.com/office/word/2010/wordml" xmlns:w15="http://schemas.microsoft.com/office/word/2012/wordml" xmlns:w16cex="http://schemas.microsoft.com/office/word/2018/wordml/cex" xmlns:w16cid="http://schemas.microsoft.com/office/word/2016/wordml/cid" xmlns:w16="http://schemas.microsoft.com/office/word/2018/wordml" xmlns:w16du="http://schemas.microsoft.com/office/word/2023/wordml/word16du" xmlns:w16sdtdh="http://schemas.microsoft.com/office/word/2020/wordml/sdtdatahash" xmlns:w16sdtfl="http://schemas.microsoft.com/office/word/2024/wordml/sdtformatlock" xmlns:w16se="http://schemas.microsoft.com/office/word/2015/wordml/symex" xmlns:wpg="http://schemas.microsoft.com/office/word/2010/wordprocessingGroup" xmlns:wpi="http://schemas.microsoft.com/office/word/2010/wordprocessingInk" xmlns:wne="http://schemas.microsoft.com/office/word/2006/wordml" xmlns:wps="http://schemas.microsoft.com/office/word/2010/wordprocessingShape" mc:Ignorable="w14 w15 w16se w16cid w16 w16cex w16sdtdh w16sdtfl w16du wp14">
   <w:p>
     <w:pPr>
       <w:pStyle w:val="Header"/>
@@ -23982,7 +23979,7 @@
 </file>
 
 <file path=word/header2.xml><?xml version="1.0" encoding="utf-8"?>
-<w:hdr xmlns:wpc="http://schemas.microsoft.com/office/word/2010/wordprocessingCanvas" xmlns:cx="http://schemas.microsoft.com/office/drawing/2014/chartex" xmlns:mc="http://schemas.openxmlformats.org/markup-compatibility/2006" xmlns:o="urn:schemas-microsoft-com:office:office" xmlns:r="http://schemas.openxmlformats.org/officeDocument/2006/relationships" xmlns:m="http://schemas.openxmlformats.org/officeDocument/2006/math" xmlns:v="urn:schemas-microsoft-com:vml" xmlns:wp14="http://schemas.microsoft.com/office/word/2010/wordprocessingDrawing" xmlns:wp="http://schemas.openxmlformats.org/drawingml/2006/wordprocessingDrawing" xmlns:w10="urn:schemas-microsoft-com:office:word" xmlns:w="http://schemas.openxmlformats.org/wordprocessingml/2006/main" xmlns:w14="http://schemas.microsoft.com/office/word/2010/wordml" xmlns:w15="http://schemas.microsoft.com/office/word/2012/wordml" xmlns:w16se="http://schemas.microsoft.com/office/word/2015/wordml/symex" xmlns:wpg="http://schemas.microsoft.com/office/word/2010/wordprocessingGroup" xmlns:wpi="http://schemas.microsoft.com/office/word/2010/wordprocessingInk" xmlns:wne="http://schemas.microsoft.com/office/word/2006/wordml" xmlns:wps="http://schemas.microsoft.com/office/word/2010/wordprocessingShape" mc:Ignorable="w14 w15 w16se wp14">
+<w:hdr xmlns:wpc="http://schemas.microsoft.com/office/word/2010/wordprocessingCanvas" xmlns:cx="http://schemas.microsoft.com/office/drawing/2014/chartex" xmlns:cx1="http://schemas.microsoft.com/office/drawing/2015/9/8/chartex" xmlns:cx2="http://schemas.microsoft.com/office/drawing/2015/10/21/chartex" xmlns:cx3="http://schemas.microsoft.com/office/drawing/2016/5/9/chartex" xmlns:cx4="http://schemas.microsoft.com/office/drawing/2016/5/10/chartex" xmlns:cx5="http://schemas.microsoft.com/office/drawing/2016/5/11/chartex" xmlns:cx6="http://schemas.microsoft.com/office/drawing/2016/5/12/chartex" xmlns:cx7="http://schemas.microsoft.com/office/drawing/2016/5/13/chartex" xmlns:cx8="http://schemas.microsoft.com/office/drawing/2016/5/14/chartex" xmlns:mc="http://schemas.openxmlformats.org/markup-compatibility/2006" xmlns:aink="http://schemas.microsoft.com/office/drawing/2016/ink" xmlns:am3d="http://schemas.microsoft.com/office/drawing/2017/model3d" xmlns:o="urn:schemas-microsoft-com:office:office" xmlns:oel="http://schemas.microsoft.com/office/2019/extlst" xmlns:r="http://schemas.openxmlformats.org/officeDocument/2006/relationships" xmlns:m="http://schemas.openxmlformats.org/officeDocument/2006/math" xmlns:v="urn:schemas-microsoft-com:vml" xmlns:wp14="http://schemas.microsoft.com/office/word/2010/wordprocessingDrawing" xmlns:wp="http://schemas.openxmlformats.org/drawingml/2006/wordprocessingDrawing" xmlns:w10="urn:schemas-microsoft-com:office:word" xmlns:w="http://schemas.openxmlformats.org/wordprocessingml/2006/main" xmlns:w14="http://schemas.microsoft.com/office/word/2010/wordml" xmlns:w15="http://schemas.microsoft.com/office/word/2012/wordml" xmlns:w16cex="http://schemas.microsoft.com/office/word/2018/wordml/cex" xmlns:w16cid="http://schemas.microsoft.com/office/word/2016/wordml/cid" xmlns:w16="http://schemas.microsoft.com/office/word/2018/wordml" xmlns:w16du="http://schemas.microsoft.com/office/word/2023/wordml/word16du" xmlns:w16sdtdh="http://schemas.microsoft.com/office/word/2020/wordml/sdtdatahash" xmlns:w16sdtfl="http://schemas.microsoft.com/office/word/2024/wordml/sdtformatlock" xmlns:w16se="http://schemas.microsoft.com/office/word/2015/wordml/symex" xmlns:wpg="http://schemas.microsoft.com/office/word/2010/wordprocessingGroup" xmlns:wpi="http://schemas.microsoft.com/office/word/2010/wordprocessingInk" xmlns:wne="http://schemas.microsoft.com/office/word/2006/wordml" xmlns:wps="http://schemas.microsoft.com/office/word/2010/wordprocessingShape" mc:Ignorable="w14 w15 w16se w16cid w16 w16cex w16sdtdh w16sdtfl w16du wp14">
   <w:p>
     <w:pPr>
       <w:pStyle w:val="Header"/>
@@ -23992,7 +23989,7 @@
 </file>
 
 <file path=word/header3.xml><?xml version="1.0" encoding="utf-8"?>
-<w:hdr xmlns:wpc="http://schemas.microsoft.com/office/word/2010/wordprocessingCanvas" xmlns:cx="http://schemas.microsoft.com/office/drawing/2014/chartex" xmlns:mc="http://schemas.openxmlformats.org/markup-compatibility/2006" xmlns:o="urn:schemas-microsoft-com:office:office" xmlns:r="http://schemas.openxmlformats.org/officeDocument/2006/relationships" xmlns:m="http://schemas.openxmlformats.org/officeDocument/2006/math" xmlns:v="urn:schemas-microsoft-com:vml" xmlns:wp14="http://schemas.microsoft.com/office/word/2010/wordprocessingDrawing" xmlns:wp="http://schemas.openxmlformats.org/drawingml/2006/wordprocessingDrawing" xmlns:w10="urn:schemas-microsoft-com:office:word" xmlns:w="http://schemas.openxmlformats.org/wordprocessingml/2006/main" xmlns:w14="http://schemas.microsoft.com/office/word/2010/wordml" xmlns:w15="http://schemas.microsoft.com/office/word/2012/wordml" xmlns:w16se="http://schemas.microsoft.com/office/word/2015/wordml/symex" xmlns:wpg="http://schemas.microsoft.com/office/word/2010/wordprocessingGroup" xmlns:wpi="http://schemas.microsoft.com/office/word/2010/wordprocessingInk" xmlns:wne="http://schemas.microsoft.com/office/word/2006/wordml" xmlns:wps="http://schemas.microsoft.com/office/word/2010/wordprocessingShape" mc:Ignorable="w14 w15 w16se wp14">
+<w:hdr xmlns:wpc="http://schemas.microsoft.com/office/word/2010/wordprocessingCanvas" xmlns:cx="http://schemas.microsoft.com/office/drawing/2014/chartex" xmlns:cx1="http://schemas.microsoft.com/office/drawing/2015/9/8/chartex" xmlns:cx2="http://schemas.microsoft.com/office/drawing/2015/10/21/chartex" xmlns:cx3="http://schemas.microsoft.com/office/drawing/2016/5/9/chartex" xmlns:cx4="http://schemas.microsoft.com/office/drawing/2016/5/10/chartex" xmlns:cx5="http://schemas.microsoft.com/office/drawing/2016/5/11/chartex" xmlns:cx6="http://schemas.microsoft.com/office/drawing/2016/5/12/chartex" xmlns:cx7="http://schemas.microsoft.com/office/drawing/2016/5/13/chartex" xmlns:cx8="http://schemas.microsoft.com/office/drawing/2016/5/14/chartex" xmlns:mc="http://schemas.openxmlformats.org/markup-compatibility/2006" xmlns:aink="http://schemas.microsoft.com/office/drawing/2016/ink" xmlns:am3d="http://schemas.microsoft.com/office/drawing/2017/model3d" xmlns:o="urn:schemas-microsoft-com:office:office" xmlns:oel="http://schemas.microsoft.com/office/2019/extlst" xmlns:r="http://schemas.openxmlformats.org/officeDocument/2006/relationships" xmlns:m="http://schemas.openxmlformats.org/officeDocument/2006/math" xmlns:v="urn:schemas-microsoft-com:vml" xmlns:wp14="http://schemas.microsoft.com/office/word/2010/wordprocessingDrawing" xmlns:wp="http://schemas.openxmlformats.org/drawingml/2006/wordprocessingDrawing" xmlns:w10="urn:schemas-microsoft-com:office:word" xmlns:w="http://schemas.openxmlformats.org/wordprocessingml/2006/main" xmlns:w14="http://schemas.microsoft.com/office/word/2010/wordml" xmlns:w15="http://schemas.microsoft.com/office/word/2012/wordml" xmlns:w16cex="http://schemas.microsoft.com/office/word/2018/wordml/cex" xmlns:w16cid="http://schemas.microsoft.com/office/word/2016/wordml/cid" xmlns:w16="http://schemas.microsoft.com/office/word/2018/wordml" xmlns:w16du="http://schemas.microsoft.com/office/word/2023/wordml/word16du" xmlns:w16sdtdh="http://schemas.microsoft.com/office/word/2020/wordml/sdtdatahash" xmlns:w16sdtfl="http://schemas.microsoft.com/office/word/2024/wordml/sdtformatlock" xmlns:w16se="http://schemas.microsoft.com/office/word/2015/wordml/symex" xmlns:wpg="http://schemas.microsoft.com/office/word/2010/wordprocessingGroup" xmlns:wpi="http://schemas.microsoft.com/office/word/2010/wordprocessingInk" xmlns:wne="http://schemas.microsoft.com/office/word/2006/wordml" xmlns:wps="http://schemas.microsoft.com/office/word/2010/wordprocessingShape" mc:Ignorable="w14 w15 w16se w16cid w16 w16cex w16sdtdh w16sdtfl w16du wp14">
   <w:p>
     <w:pPr>
       <w:pStyle w:val="Header"/>
@@ -24002,7 +23999,7 @@
 </file>
 
 <file path=word/numbering.xml><?xml version="1.0" encoding="utf-8"?>
-<w:numbering xmlns:wpc="http://schemas.microsoft.com/office/word/2010/wordprocessingCanvas" xmlns:cx="http://schemas.microsoft.com/office/drawing/2014/chartex" xmlns:mc="http://schemas.openxmlformats.org/markup-compatibility/2006" xmlns:o="urn:schemas-microsoft-com:office:office" xmlns:r="http://schemas.openxmlformats.org/officeDocument/2006/relationships" xmlns:m="http://schemas.openxmlformats.org/officeDocument/2006/math" xmlns:v="urn:schemas-microsoft-com:vml" xmlns:wp14="http://schemas.microsoft.com/office/word/2010/wordprocessingDrawing" xmlns:wp="http://schemas.openxmlformats.org/drawingml/2006/wordprocessingDrawing" xmlns:w10="urn:schemas-microsoft-com:office:word" xmlns:w="http://schemas.openxmlformats.org/wordprocessingml/2006/main" xmlns:w14="http://schemas.microsoft.com/office/word/2010/wordml" xmlns:w15="http://schemas.microsoft.com/office/word/2012/wordml" xmlns:w16se="http://schemas.microsoft.com/office/word/2015/wordml/symex" xmlns:wpg="http://schemas.microsoft.com/office/word/2010/wordprocessingGroup" xmlns:wpi="http://schemas.microsoft.com/office/word/2010/wordprocessingInk" xmlns:wne="http://schemas.microsoft.com/office/word/2006/wordml" xmlns:wps="http://schemas.microsoft.com/office/word/2010/wordprocessingShape" mc:Ignorable="w14 w15 w16se wp14">
+<w:numbering xmlns:wpc="http://schemas.microsoft.com/office/word/2010/wordprocessingCanvas" xmlns:cx="http://schemas.microsoft.com/office/drawing/2014/chartex" xmlns:cx1="http://schemas.microsoft.com/office/drawing/2015/9/8/chartex" xmlns:cx2="http://schemas.microsoft.com/office/drawing/2015/10/21/chartex" xmlns:cx3="http://schemas.microsoft.com/office/drawing/2016/5/9/chartex" xmlns:cx4="http://schemas.microsoft.com/office/drawing/2016/5/10/chartex" xmlns:cx5="http://schemas.microsoft.com/office/drawing/2016/5/11/chartex" xmlns:cx6="http://schemas.microsoft.com/office/drawing/2016/5/12/chartex" xmlns:cx7="http://schemas.microsoft.com/office/drawing/2016/5/13/chartex" xmlns:cx8="http://schemas.microsoft.com/office/drawing/2016/5/14/chartex" xmlns:mc="http://schemas.openxmlformats.org/markup-compatibility/2006" xmlns:aink="http://schemas.microsoft.com/office/drawing/2016/ink" xmlns:am3d="http://schemas.microsoft.com/office/drawing/2017/model3d" xmlns:o="urn:schemas-microsoft-com:office:office" xmlns:oel="http://schemas.microsoft.com/office/2019/extlst" xmlns:r="http://schemas.openxmlformats.org/officeDocument/2006/relationships" xmlns:m="http://schemas.openxmlformats.org/officeDocument/2006/math" xmlns:v="urn:schemas-microsoft-com:vml" xmlns:wp14="http://schemas.microsoft.com/office/word/2010/wordprocessingDrawing" xmlns:wp="http://schemas.openxmlformats.org/drawingml/2006/wordprocessingDrawing" xmlns:w10="urn:schemas-microsoft-com:office:word" xmlns:w="http://schemas.openxmlformats.org/wordprocessingml/2006/main" xmlns:w14="http://schemas.microsoft.com/office/word/2010/wordml" xmlns:w15="http://schemas.microsoft.com/office/word/2012/wordml" xmlns:w16cex="http://schemas.microsoft.com/office/word/2018/wordml/cex" xmlns:w16cid="http://schemas.microsoft.com/office/word/2016/wordml/cid" xmlns:w16="http://schemas.microsoft.com/office/word/2018/wordml" xmlns:w16du="http://schemas.microsoft.com/office/word/2023/wordml/word16du" xmlns:w16sdtdh="http://schemas.microsoft.com/office/word/2020/wordml/sdtdatahash" xmlns:w16sdtfl="http://schemas.microsoft.com/office/word/2024/wordml/sdtformatlock" xmlns:w16se="http://schemas.microsoft.com/office/word/2015/wordml/symex" xmlns:wpg="http://schemas.microsoft.com/office/word/2010/wordprocessingGroup" xmlns:wpi="http://schemas.microsoft.com/office/word/2010/wordprocessingInk" xmlns:wne="http://schemas.microsoft.com/office/word/2006/wordml" xmlns:wps="http://schemas.microsoft.com/office/word/2010/wordprocessingShape" mc:Ignorable="w14 w15 w16se w16cid w16 w16cex w16sdtdh w16sdtfl w16du wp14">
   <w:abstractNum w:abstractNumId="0" w15:restartNumberingAfterBreak="0">
     <w:nsid w:val="08560347"/>
     <w:multiLevelType w:val="hybridMultilevel"/>
@@ -26125,61 +26122,61 @@
       </w:pPr>
     </w:lvl>
   </w:abstractNum>
-  <w:num w:numId="1">
+  <w:num w:numId="1" w16cid:durableId="104349972">
     <w:abstractNumId w:val="18"/>
   </w:num>
-  <w:num w:numId="2">
+  <w:num w:numId="2" w16cid:durableId="1790126577">
     <w:abstractNumId w:val="15"/>
   </w:num>
-  <w:num w:numId="3">
+  <w:num w:numId="3" w16cid:durableId="1075081075">
     <w:abstractNumId w:val="3"/>
   </w:num>
-  <w:num w:numId="4">
+  <w:num w:numId="4" w16cid:durableId="981811608">
     <w:abstractNumId w:val="1"/>
   </w:num>
-  <w:num w:numId="5">
+  <w:num w:numId="5" w16cid:durableId="587538191">
     <w:abstractNumId w:val="12"/>
   </w:num>
-  <w:num w:numId="6">
+  <w:num w:numId="6" w16cid:durableId="2068334109">
     <w:abstractNumId w:val="16"/>
   </w:num>
-  <w:num w:numId="7">
+  <w:num w:numId="7" w16cid:durableId="1166358534">
     <w:abstractNumId w:val="16"/>
   </w:num>
-  <w:num w:numId="8">
+  <w:num w:numId="8" w16cid:durableId="1640301278">
     <w:abstractNumId w:val="16"/>
   </w:num>
-  <w:num w:numId="9">
+  <w:num w:numId="9" w16cid:durableId="1614944311">
     <w:abstractNumId w:val="4"/>
   </w:num>
-  <w:num w:numId="10">
+  <w:num w:numId="10" w16cid:durableId="245187572">
     <w:abstractNumId w:val="5"/>
   </w:num>
-  <w:num w:numId="11">
+  <w:num w:numId="11" w16cid:durableId="1311130777">
     <w:abstractNumId w:val="9"/>
   </w:num>
-  <w:num w:numId="12">
+  <w:num w:numId="12" w16cid:durableId="457989904">
     <w:abstractNumId w:val="16"/>
   </w:num>
-  <w:num w:numId="13">
+  <w:num w:numId="13" w16cid:durableId="1587882689">
     <w:abstractNumId w:val="16"/>
   </w:num>
-  <w:num w:numId="14">
+  <w:num w:numId="14" w16cid:durableId="1421219400">
     <w:abstractNumId w:val="16"/>
   </w:num>
-  <w:num w:numId="15">
+  <w:num w:numId="15" w16cid:durableId="1249003321">
     <w:abstractNumId w:val="16"/>
   </w:num>
-  <w:num w:numId="16">
+  <w:num w:numId="16" w16cid:durableId="775254470">
     <w:abstractNumId w:val="8"/>
   </w:num>
-  <w:num w:numId="17">
+  <w:num w:numId="17" w16cid:durableId="351805147">
     <w:abstractNumId w:val="16"/>
   </w:num>
-  <w:num w:numId="18">
+  <w:num w:numId="18" w16cid:durableId="905846253">
     <w:abstractNumId w:val="10"/>
   </w:num>
-  <w:num w:numId="19">
+  <w:num w:numId="19" w16cid:durableId="1285235668">
     <w:abstractNumId w:val="10"/>
     <w:lvlOverride w:ilvl="0">
       <w:lvl w:ilvl="0" w:tplc="C2828D58">
@@ -26285,25 +26282,25 @@
       </w:lvl>
     </w:lvlOverride>
   </w:num>
-  <w:num w:numId="20">
+  <w:num w:numId="20" w16cid:durableId="722488371">
     <w:abstractNumId w:val="2"/>
   </w:num>
-  <w:num w:numId="21">
+  <w:num w:numId="21" w16cid:durableId="1700547663">
     <w:abstractNumId w:val="0"/>
   </w:num>
-  <w:num w:numId="22">
+  <w:num w:numId="22" w16cid:durableId="1998873968">
     <w:abstractNumId w:val="16"/>
   </w:num>
-  <w:num w:numId="23">
+  <w:num w:numId="23" w16cid:durableId="475684710">
     <w:abstractNumId w:val="13"/>
   </w:num>
-  <w:num w:numId="24">
+  <w:num w:numId="24" w16cid:durableId="850293550">
     <w:abstractNumId w:val="16"/>
   </w:num>
-  <w:num w:numId="25">
+  <w:num w:numId="25" w16cid:durableId="1914586503">
     <w:abstractNumId w:val="7"/>
   </w:num>
-  <w:num w:numId="26">
+  <w:num w:numId="26" w16cid:durableId="2115248743">
     <w:abstractNumId w:val="18"/>
     <w:lvlOverride w:ilvl="0">
       <w:startOverride w:val="3"/>
@@ -26312,35 +26309,35 @@
       <w:startOverride w:val="8"/>
     </w:lvlOverride>
   </w:num>
-  <w:num w:numId="27">
+  <w:num w:numId="27" w16cid:durableId="734664335">
     <w:abstractNumId w:val="14"/>
   </w:num>
-  <w:num w:numId="28">
+  <w:num w:numId="28" w16cid:durableId="168453372">
     <w:abstractNumId w:val="6"/>
   </w:num>
-  <w:num w:numId="29">
+  <w:num w:numId="29" w16cid:durableId="1545142553">
     <w:abstractNumId w:val="11"/>
   </w:num>
-  <w:num w:numId="30">
+  <w:num w:numId="30" w16cid:durableId="23095223">
     <w:abstractNumId w:val="17"/>
   </w:num>
-  <w:num w:numId="31">
+  <w:num w:numId="31" w16cid:durableId="328556259">
     <w:abstractNumId w:val="18"/>
   </w:num>
-  <w:num w:numId="32">
+  <w:num w:numId="32" w16cid:durableId="2138835036">
     <w:abstractNumId w:val="18"/>
   </w:num>
-  <w:num w:numId="33">
+  <w:num w:numId="33" w16cid:durableId="1568958009">
     <w:abstractNumId w:val="18"/>
   </w:num>
-  <w:num w:numId="34">
+  <w:num w:numId="34" w16cid:durableId="1934782083">
     <w:abstractNumId w:val="18"/>
   </w:num>
 </w:numbering>
 </file>
 
 <file path=word/styles.xml><?xml version="1.0" encoding="utf-8"?>
-<w:styles xmlns:mc="http://schemas.openxmlformats.org/markup-compatibility/2006" xmlns:r="http://schemas.openxmlformats.org/officeDocument/2006/relationships" xmlns:w="http://schemas.openxmlformats.org/wordprocessingml/2006/main" xmlns:w14="http://schemas.microsoft.com/office/word/2010/wordml" xmlns:w15="http://schemas.microsoft.com/office/word/2012/wordml" xmlns:w16se="http://schemas.microsoft.com/office/word/2015/wordml/symex" mc:Ignorable="w14 w15 w16se">
+<w:styles xmlns:mc="http://schemas.openxmlformats.org/markup-compatibility/2006" xmlns:r="http://schemas.openxmlformats.org/officeDocument/2006/relationships" xmlns:w="http://schemas.openxmlformats.org/wordprocessingml/2006/main" xmlns:w14="http://schemas.microsoft.com/office/word/2010/wordml" xmlns:w15="http://schemas.microsoft.com/office/word/2012/wordml" xmlns:w16cex="http://schemas.microsoft.com/office/word/2018/wordml/cex" xmlns:w16cid="http://schemas.microsoft.com/office/word/2016/wordml/cid" xmlns:w16="http://schemas.microsoft.com/office/word/2018/wordml" xmlns:w16du="http://schemas.microsoft.com/office/word/2023/wordml/word16du" xmlns:w16sdtdh="http://schemas.microsoft.com/office/word/2020/wordml/sdtdatahash" xmlns:w16sdtfl="http://schemas.microsoft.com/office/word/2024/wordml/sdtformatlock" xmlns:w16se="http://schemas.microsoft.com/office/word/2015/wordml/symex" mc:Ignorable="w14 w15 w16se w16cid w16 w16cex w16sdtdh w16sdtfl w16du">
   <w:docDefaults>
     <w:rPrDefault>
       <w:rPr>
@@ -26356,7 +26353,7 @@
       </w:pPr>
     </w:pPrDefault>
   </w:docDefaults>
-  <w:latentStyles w:defLockedState="0" w:defUIPriority="99" w:defSemiHidden="0" w:defUnhideWhenUsed="0" w:defQFormat="0" w:count="371">
+  <w:latentStyles w:defLockedState="0" w:defUIPriority="99" w:defSemiHidden="0" w:defUnhideWhenUsed="0" w:defQFormat="0" w:count="376">
     <w:lsdException w:name="Normal" w:uiPriority="0" w:qFormat="1"/>
     <w:lsdException w:name="heading 1" w:uiPriority="0" w:qFormat="1"/>
     <w:lsdException w:name="heading 2" w:semiHidden="1" w:uiPriority="0" w:unhideWhenUsed="1" w:qFormat="1"/>
@@ -26728,6 +26725,11 @@
     <w:lsdException w:name="List Table 5 Dark Accent 6" w:uiPriority="50"/>
     <w:lsdException w:name="List Table 6 Colorful Accent 6" w:uiPriority="51"/>
     <w:lsdException w:name="List Table 7 Colorful Accent 6" w:uiPriority="52"/>
+    <w:lsdException w:name="Mention" w:semiHidden="1" w:unhideWhenUsed="1"/>
+    <w:lsdException w:name="Smart Hyperlink" w:semiHidden="1" w:unhideWhenUsed="1"/>
+    <w:lsdException w:name="Hashtag" w:semiHidden="1" w:unhideWhenUsed="1"/>
+    <w:lsdException w:name="Unresolved Mention" w:semiHidden="1" w:unhideWhenUsed="1"/>
+    <w:lsdException w:name="Smart Link" w:semiHidden="1" w:unhideWhenUsed="1"/>
   </w:latentStyles>
   <w:style w:type="paragraph" w:default="1" w:styleId="Normal">
     <w:name w:val="Normal"/>
@@ -26936,6 +26938,7 @@
   <w:style w:type="character" w:default="1" w:styleId="DefaultParagraphFont">
     <w:name w:val="Default Paragraph Font"/>
     <w:uiPriority w:val="1"/>
+    <w:semiHidden/>
     <w:unhideWhenUsed/>
   </w:style>
   <w:style w:type="table" w:default="1" w:styleId="TableNormal">
@@ -27493,7 +27496,7 @@
 </file>
 
 <file path=word/glossary/document.xml><?xml version="1.0" encoding="utf-8"?>
-<w:glossaryDocument xmlns:wpc="http://schemas.microsoft.com/office/word/2010/wordprocessingCanvas" xmlns:cx="http://schemas.microsoft.com/office/drawing/2014/chartex" xmlns:mc="http://schemas.openxmlformats.org/markup-compatibility/2006" xmlns:o="urn:schemas-microsoft-com:office:office" xmlns:r="http://schemas.openxmlformats.org/officeDocument/2006/relationships" xmlns:m="http://schemas.openxmlformats.org/officeDocument/2006/math" xmlns:v="urn:schemas-microsoft-com:vml" xmlns:wp14="http://schemas.microsoft.com/office/word/2010/wordprocessingDrawing" xmlns:wp="http://schemas.openxmlformats.org/drawingml/2006/wordprocessingDrawing" xmlns:w10="urn:schemas-microsoft-com:office:word" xmlns:w="http://schemas.openxmlformats.org/wordprocessingml/2006/main" xmlns:w14="http://schemas.microsoft.com/office/word/2010/wordml" xmlns:w15="http://schemas.microsoft.com/office/word/2012/wordml" xmlns:w16se="http://schemas.microsoft.com/office/word/2015/wordml/symex" xmlns:wpg="http://schemas.microsoft.com/office/word/2010/wordprocessingGroup" xmlns:wpi="http://schemas.microsoft.com/office/word/2010/wordprocessingInk" xmlns:wne="http://schemas.microsoft.com/office/word/2006/wordml" xmlns:wps="http://schemas.microsoft.com/office/word/2010/wordprocessingShape" mc:Ignorable="w14 w15 w16se wp14">
+<w:glossaryDocument xmlns:wpc="http://schemas.microsoft.com/office/word/2010/wordprocessingCanvas" xmlns:cx="http://schemas.microsoft.com/office/drawing/2014/chartex" xmlns:cx1="http://schemas.microsoft.com/office/drawing/2015/9/8/chartex" xmlns:cx2="http://schemas.microsoft.com/office/drawing/2015/10/21/chartex" xmlns:cx3="http://schemas.microsoft.com/office/drawing/2016/5/9/chartex" xmlns:cx4="http://schemas.microsoft.com/office/drawing/2016/5/10/chartex" xmlns:cx5="http://schemas.microsoft.com/office/drawing/2016/5/11/chartex" xmlns:cx6="http://schemas.microsoft.com/office/drawing/2016/5/12/chartex" xmlns:cx7="http://schemas.microsoft.com/office/drawing/2016/5/13/chartex" xmlns:cx8="http://schemas.microsoft.com/office/drawing/2016/5/14/chartex" xmlns:mc="http://schemas.openxmlformats.org/markup-compatibility/2006" xmlns:aink="http://schemas.microsoft.com/office/drawing/2016/ink" xmlns:am3d="http://schemas.microsoft.com/office/drawing/2017/model3d" xmlns:o="urn:schemas-microsoft-com:office:office" xmlns:oel="http://schemas.microsoft.com/office/2019/extlst" xmlns:r="http://schemas.openxmlformats.org/officeDocument/2006/relationships" xmlns:m="http://schemas.openxmlformats.org/officeDocument/2006/math" xmlns:v="urn:schemas-microsoft-com:vml" xmlns:wp14="http://schemas.microsoft.com/office/word/2010/wordprocessingDrawing" xmlns:wp="http://schemas.openxmlformats.org/drawingml/2006/wordprocessingDrawing" xmlns:w10="urn:schemas-microsoft-com:office:word" xmlns:w="http://schemas.openxmlformats.org/wordprocessingml/2006/main" xmlns:w14="http://schemas.microsoft.com/office/word/2010/wordml" xmlns:w15="http://schemas.microsoft.com/office/word/2012/wordml" xmlns:w16cex="http://schemas.microsoft.com/office/word/2018/wordml/cex" xmlns:w16cid="http://schemas.microsoft.com/office/word/2016/wordml/cid" xmlns:w16="http://schemas.microsoft.com/office/word/2018/wordml" xmlns:w16du="http://schemas.microsoft.com/office/word/2023/wordml/word16du" xmlns:w16sdtdh="http://schemas.microsoft.com/office/word/2020/wordml/sdtdatahash" xmlns:w16sdtfl="http://schemas.microsoft.com/office/word/2024/wordml/sdtformatlock" xmlns:w16se="http://schemas.microsoft.com/office/word/2015/wordml/symex" xmlns:wpg="http://schemas.microsoft.com/office/word/2010/wordprocessingGroup" xmlns:wpi="http://schemas.microsoft.com/office/word/2010/wordprocessingInk" xmlns:wne="http://schemas.microsoft.com/office/word/2006/wordml" xmlns:wps="http://schemas.microsoft.com/office/word/2010/wordprocessingShape" mc:Ignorable="w14 w15 w16se w16cid w16 w16cex w16sdtdh w16sdtfl w16du wp14">
   <w:docParts>
     <w:docPart>
       <w:docPartPr>
@@ -27519,7 +27522,7 @@
             <w:rPr>
               <w:rFonts w:asciiTheme="majorHAnsi" w:eastAsiaTheme="majorEastAsia" w:hAnsiTheme="majorHAnsi" w:cstheme="majorBidi"/>
               <w:caps/>
-              <w:color w:val="5B9BD5" w:themeColor="accent1"/>
+              <w:color w:val="156082" w:themeColor="accent1"/>
               <w:sz w:val="80"/>
               <w:szCs w:val="80"/>
             </w:rPr>
@@ -27550,7 +27553,7 @@
           </w:pPr>
           <w:r>
             <w:rPr>
-              <w:color w:val="5B9BD5" w:themeColor="accent1"/>
+              <w:color w:val="156082" w:themeColor="accent1"/>
               <w:sz w:val="28"/>
               <w:szCs w:val="28"/>
             </w:rPr>
@@ -27564,7 +27567,7 @@
 </file>
 
 <file path=word/glossary/fontTable.xml><?xml version="1.0" encoding="utf-8"?>
-<w:fonts xmlns:mc="http://schemas.openxmlformats.org/markup-compatibility/2006" xmlns:r="http://schemas.openxmlformats.org/officeDocument/2006/relationships" xmlns:w="http://schemas.openxmlformats.org/wordprocessingml/2006/main" xmlns:w14="http://schemas.microsoft.com/office/word/2010/wordml" xmlns:w15="http://schemas.microsoft.com/office/word/2012/wordml" xmlns:w16se="http://schemas.microsoft.com/office/word/2015/wordml/symex" mc:Ignorable="w14 w15 w16se">
+<w:fonts xmlns:mc="http://schemas.openxmlformats.org/markup-compatibility/2006" xmlns:r="http://schemas.openxmlformats.org/officeDocument/2006/relationships" xmlns:w="http://schemas.openxmlformats.org/wordprocessingml/2006/main" xmlns:w14="http://schemas.microsoft.com/office/word/2010/wordml" xmlns:w15="http://schemas.microsoft.com/office/word/2012/wordml" xmlns:w16cex="http://schemas.microsoft.com/office/word/2018/wordml/cex" xmlns:w16cid="http://schemas.microsoft.com/office/word/2016/wordml/cid" xmlns:w16="http://schemas.microsoft.com/office/word/2018/wordml" xmlns:w16du="http://schemas.microsoft.com/office/word/2023/wordml/word16du" xmlns:w16sdtdh="http://schemas.microsoft.com/office/word/2020/wordml/sdtdatahash" xmlns:w16sdtfl="http://schemas.microsoft.com/office/word/2024/wordml/sdtformatlock" xmlns:w16se="http://schemas.microsoft.com/office/word/2015/wordml/symex" mc:Ignorable="w14 w15 w16se w16cid w16 w16cex w16sdtdh w16sdtfl w16du">
   <w:font w:name="Times New Roman">
     <w:panose1 w:val="02020603050405020304"/>
     <w:charset w:val="00"/>
@@ -27622,6 +27625,7 @@
   </w:font>
   <w:font w:name="Lucida Sans">
     <w:altName w:val="Lucida Sans Unicode"/>
+    <w:panose1 w:val="020B0602030504020204"/>
     <w:charset w:val="00"/>
     <w:family w:val="swiss"/>
     <w:pitch w:val="variable"/>
@@ -27634,11 +27638,23 @@
     <w:pitch w:val="variable"/>
     <w:sig w:usb0="E4002EFF" w:usb1="C000247B" w:usb2="00000009" w:usb3="00000000" w:csb0="000001FF" w:csb1="00000000"/>
   </w:font>
+  <w:font w:name="Aptos">
+    <w:charset w:val="00"/>
+    <w:family w:val="swiss"/>
+    <w:pitch w:val="variable"/>
+    <w:sig w:usb0="20000287" w:usb1="00000003" w:usb2="00000000" w:usb3="00000000" w:csb0="0000019F" w:csb1="00000000"/>
+  </w:font>
+  <w:font w:name="Aptos Display">
+    <w:charset w:val="00"/>
+    <w:family w:val="swiss"/>
+    <w:pitch w:val="variable"/>
+    <w:sig w:usb0="20000287" w:usb1="00000003" w:usb2="00000000" w:usb3="00000000" w:csb0="0000019F" w:csb1="00000000"/>
+  </w:font>
 </w:fonts>
 </file>
 
 <file path=word/glossary/settings.xml><?xml version="1.0" encoding="utf-8"?>
-<w:settings xmlns:mc="http://schemas.openxmlformats.org/markup-compatibility/2006" xmlns:o="urn:schemas-microsoft-com:office:office" xmlns:r="http://schemas.openxmlformats.org/officeDocument/2006/relationships" xmlns:m="http://schemas.openxmlformats.org/officeDocument/2006/math" xmlns:v="urn:schemas-microsoft-com:vml" xmlns:w10="urn:schemas-microsoft-com:office:word" xmlns:w="http://schemas.openxmlformats.org/wordprocessingml/2006/main" xmlns:w14="http://schemas.microsoft.com/office/word/2010/wordml" xmlns:w15="http://schemas.microsoft.com/office/word/2012/wordml" xmlns:w16se="http://schemas.microsoft.com/office/word/2015/wordml/symex" xmlns:sl="http://schemas.openxmlformats.org/schemaLibrary/2006/main" mc:Ignorable="w14 w15 w16se">
+<w:settings xmlns:mc="http://schemas.openxmlformats.org/markup-compatibility/2006" xmlns:o="urn:schemas-microsoft-com:office:office" xmlns:r="http://schemas.openxmlformats.org/officeDocument/2006/relationships" xmlns:m="http://schemas.openxmlformats.org/officeDocument/2006/math" xmlns:v="urn:schemas-microsoft-com:vml" xmlns:w10="urn:schemas-microsoft-com:office:word" xmlns:w="http://schemas.openxmlformats.org/wordprocessingml/2006/main" xmlns:w14="http://schemas.microsoft.com/office/word/2010/wordml" xmlns:w15="http://schemas.microsoft.com/office/word/2012/wordml" xmlns:w16cex="http://schemas.microsoft.com/office/word/2018/wordml/cex" xmlns:w16cid="http://schemas.microsoft.com/office/word/2016/wordml/cid" xmlns:w16="http://schemas.microsoft.com/office/word/2018/wordml" xmlns:w16du="http://schemas.microsoft.com/office/word/2023/wordml/word16du" xmlns:w16sdtdh="http://schemas.microsoft.com/office/word/2020/wordml/sdtdatahash" xmlns:w16sdtfl="http://schemas.microsoft.com/office/word/2024/wordml/sdtformatlock" xmlns:w16se="http://schemas.microsoft.com/office/word/2015/wordml/symex" xmlns:sl="http://schemas.openxmlformats.org/schemaLibrary/2006/main" mc:Ignorable="w14 w15 w16se w16cid w16 w16cex w16sdtdh w16sdtfl w16du">
   <w:view w:val="normal"/>
   <w:defaultTabStop w:val="720"/>
   <w:characterSpacingControl w:val="doNotCompress"/>
@@ -27649,6 +27665,7 @@
     <w:compatSetting w:name="enableOpenTypeFeatures" w:uri="http://schemas.microsoft.com/office/word" w:val="1"/>
     <w:compatSetting w:name="doNotFlipMirrorIndents" w:uri="http://schemas.microsoft.com/office/word" w:val="1"/>
     <w:compatSetting w:name="differentiateMultirowTableHeaders" w:uri="http://schemas.microsoft.com/office/word" w:val="1"/>
+    <w:compatSetting w:name="useWord2013TrackBottomHyphenation" w:uri="http://schemas.microsoft.com/office/word" w:val="1"/>
   </w:compat>
   <w:rsids>
     <w:rsidRoot w:val="00F152FF"/>
@@ -27660,6 +27677,7 @@
     <w:rsid w:val="00284075"/>
     <w:rsid w:val="002A48CE"/>
     <w:rsid w:val="003462B6"/>
+    <w:rsid w:val="00362C4A"/>
     <w:rsid w:val="00416DE4"/>
     <w:rsid w:val="00771CB3"/>
     <w:rsid w:val="007D4F22"/>
@@ -27672,6 +27690,7 @@
     <w:rsid w:val="00C04E7D"/>
     <w:rsid w:val="00C63BCC"/>
     <w:rsid w:val="00DD5612"/>
+    <w:rsid w:val="00E8733C"/>
     <w:rsid w:val="00ED642B"/>
     <w:rsid w:val="00F152FF"/>
     <w:rsid w:val="00F422C8"/>
@@ -27699,7 +27718,7 @@
 </file>
 
 <file path=word/glossary/styles.xml><?xml version="1.0" encoding="utf-8"?>
-<w:styles xmlns:mc="http://schemas.openxmlformats.org/markup-compatibility/2006" xmlns:r="http://schemas.openxmlformats.org/officeDocument/2006/relationships" xmlns:w="http://schemas.openxmlformats.org/wordprocessingml/2006/main" xmlns:w14="http://schemas.microsoft.com/office/word/2010/wordml" xmlns:w15="http://schemas.microsoft.com/office/word/2012/wordml" xmlns:w16se="http://schemas.microsoft.com/office/word/2015/wordml/symex" mc:Ignorable="w14 w15 w16se">
+<w:styles xmlns:mc="http://schemas.openxmlformats.org/markup-compatibility/2006" xmlns:r="http://schemas.openxmlformats.org/officeDocument/2006/relationships" xmlns:w="http://schemas.openxmlformats.org/wordprocessingml/2006/main" xmlns:w14="http://schemas.microsoft.com/office/word/2010/wordml" xmlns:w15="http://schemas.microsoft.com/office/word/2012/wordml" xmlns:w16cex="http://schemas.microsoft.com/office/word/2018/wordml/cex" xmlns:w16cid="http://schemas.microsoft.com/office/word/2016/wordml/cid" xmlns:w16="http://schemas.microsoft.com/office/word/2018/wordml" xmlns:w16du="http://schemas.microsoft.com/office/word/2023/wordml/word16du" xmlns:w16sdtdh="http://schemas.microsoft.com/office/word/2020/wordml/sdtdatahash" xmlns:w16sdtfl="http://schemas.microsoft.com/office/word/2024/wordml/sdtformatlock" xmlns:w16se="http://schemas.microsoft.com/office/word/2015/wordml/symex" mc:Ignorable="w14 w15 w16se w16cid w16 w16cex w16sdtdh w16sdtfl w16du">
   <w:docDefaults>
     <w:rPrDefault>
       <w:rPr>
@@ -27715,7 +27734,7 @@
       </w:pPr>
     </w:pPrDefault>
   </w:docDefaults>
-  <w:latentStyles w:defLockedState="0" w:defUIPriority="99" w:defSemiHidden="0" w:defUnhideWhenUsed="0" w:defQFormat="0" w:count="371">
+  <w:latentStyles w:defLockedState="0" w:defUIPriority="99" w:defSemiHidden="0" w:defUnhideWhenUsed="0" w:defQFormat="0" w:count="376">
     <w:lsdException w:name="Normal" w:uiPriority="0" w:qFormat="1"/>
     <w:lsdException w:name="heading 1" w:uiPriority="9" w:qFormat="1"/>
     <w:lsdException w:name="heading 2" w:semiHidden="1" w:uiPriority="9" w:unhideWhenUsed="1" w:qFormat="1"/>
@@ -28087,6 +28106,11 @@
     <w:lsdException w:name="List Table 5 Dark Accent 6" w:uiPriority="50"/>
     <w:lsdException w:name="List Table 6 Colorful Accent 6" w:uiPriority="51"/>
     <w:lsdException w:name="List Table 7 Colorful Accent 6" w:uiPriority="52"/>
+    <w:lsdException w:name="Mention" w:semiHidden="1" w:unhideWhenUsed="1"/>
+    <w:lsdException w:name="Smart Hyperlink" w:semiHidden="1" w:unhideWhenUsed="1"/>
+    <w:lsdException w:name="Hashtag" w:semiHidden="1" w:unhideWhenUsed="1"/>
+    <w:lsdException w:name="Unresolved Mention" w:semiHidden="1" w:unhideWhenUsed="1"/>
+    <w:lsdException w:name="Smart Link" w:semiHidden="1" w:unhideWhenUsed="1"/>
   </w:latentStyles>
   <w:style w:type="paragraph" w:default="1" w:styleId="Normal">
     <w:name w:val="Normal"/>
@@ -28131,7 +28155,7 @@
 </file>
 
 <file path=word/glossary/webSettings.xml><?xml version="1.0" encoding="utf-8"?>
-<w:webSettings xmlns:mc="http://schemas.openxmlformats.org/markup-compatibility/2006" xmlns:r="http://schemas.openxmlformats.org/officeDocument/2006/relationships" xmlns:w="http://schemas.openxmlformats.org/wordprocessingml/2006/main" xmlns:w14="http://schemas.microsoft.com/office/word/2010/wordml" xmlns:w15="http://schemas.microsoft.com/office/word/2012/wordml" xmlns:w16se="http://schemas.microsoft.com/office/word/2015/wordml/symex" mc:Ignorable="w14 w15 w16se">
+<w:webSettings xmlns:mc="http://schemas.openxmlformats.org/markup-compatibility/2006" xmlns:r="http://schemas.openxmlformats.org/officeDocument/2006/relationships" xmlns:w="http://schemas.openxmlformats.org/wordprocessingml/2006/main" xmlns:w14="http://schemas.microsoft.com/office/word/2010/wordml" xmlns:w15="http://schemas.microsoft.com/office/word/2012/wordml" xmlns:w16cex="http://schemas.microsoft.com/office/word/2018/wordml/cex" xmlns:w16cid="http://schemas.microsoft.com/office/word/2016/wordml/cid" xmlns:w16="http://schemas.microsoft.com/office/word/2018/wordml" xmlns:w16du="http://schemas.microsoft.com/office/word/2023/wordml/word16du" xmlns:w16sdtdh="http://schemas.microsoft.com/office/word/2020/wordml/sdtdatahash" xmlns:w16sdtfl="http://schemas.microsoft.com/office/word/2024/wordml/sdtformatlock" xmlns:w16se="http://schemas.microsoft.com/office/word/2015/wordml/symex" mc:Ignorable="w14 w15 w16se w16cid w16 w16cex w16sdtdh w16sdtfl w16du">
   <w:optimizeForBrowser/>
   <w:allowPNG/>
 </w:webSettings>
@@ -28312,6 +28336,10 @@
 </file>
 
 <file path=customXml/item1.xml><?xml version="1.0" encoding="utf-8"?>
+<b:Sources xmlns:b="http://schemas.openxmlformats.org/officeDocument/2006/bibliography" xmlns="http://schemas.openxmlformats.org/officeDocument/2006/bibliography" SelectedStyle="\APASixthEditionOfficeOnline.xsl" StyleName="APA" Version="6"/>
+</file>
+
+<file path=customXml/item2.xml><?xml version="1.0" encoding="utf-8"?>
 <CoverPageProperties xmlns="http://schemas.microsoft.com/office/2006/coverPageProps">
   <PublishDate>tp hỒ CHÍ MINH, THÁNG 8 NĂM 2017</PublishDate>
   <Abstract/>
@@ -28322,22 +28350,18 @@
 </CoverPageProperties>
 </file>
 
-<file path=customXml/item2.xml><?xml version="1.0" encoding="utf-8"?>
-<b:Sources xmlns:b="http://schemas.openxmlformats.org/officeDocument/2006/bibliography" xmlns="http://schemas.openxmlformats.org/officeDocument/2006/bibliography" SelectedStyle="\APASixthEditionOfficeOnline.xsl" StyleName="APA" Version="6"/>
+<file path=customXml/itemProps1.xml><?xml version="1.0" encoding="utf-8"?>
+<ds:datastoreItem xmlns:ds="http://schemas.openxmlformats.org/officeDocument/2006/customXml" ds:itemID="{54DEE4B9-8E50-409A-8369-565762F06F99}">
+  <ds:schemaRefs>
+    <ds:schemaRef ds:uri="http://schemas.openxmlformats.org/officeDocument/2006/bibliography"/>
+  </ds:schemaRefs>
+</ds:datastoreItem>
 </file>
 
-<file path=customXml/itemProps1.xml><?xml version="1.0" encoding="utf-8"?>
+<file path=customXml/itemProps2.xml><?xml version="1.0" encoding="utf-8"?>
 <ds:datastoreItem xmlns:ds="http://schemas.openxmlformats.org/officeDocument/2006/customXml" ds:itemID="{7CF9B333-EEBF-4915-A8F8-AE85DD7AA1D4}">
   <ds:schemaRefs>
     <ds:schemaRef ds:uri="http://schemas.microsoft.com/office/2006/coverPageProps"/>
   </ds:schemaRefs>
 </ds:datastoreItem>
-</file>
-
-<file path=customXml/itemProps2.xml><?xml version="1.0" encoding="utf-8"?>
-<ds:datastoreItem xmlns:ds="http://schemas.openxmlformats.org/officeDocument/2006/customXml" ds:itemID="{54DEE4B9-8E50-409A-8369-565762F06F99}">
-  <ds:schemaRefs>
-    <ds:schemaRef ds:uri="http://schemas.openxmlformats.org/officeDocument/2006/bibliography"/>
-  </ds:schemaRefs>
-</ds:datastoreItem>
 </file>
</xml_diff>